<commit_message>
Updates assignment with screenshot/url
</commit_message>
<xml_diff>
--- a/module-1/Sengvanhpheng-Assignment1_2.docx
+++ b/module-1/Sengvanhpheng-Assignment1_2.docx
@@ -20,7 +20,7 @@
       </w:pPr>
       <w:r>
         <w:drawing>
-          <wp:inline wp14:editId="5330DA62" wp14:anchorId="1FB5AF06">
+          <wp:inline wp14:editId="10F5339F" wp14:anchorId="1FB5AF06">
             <wp:extent cx="5943600" cy="3371850"/>
             <wp:effectExtent l="0" t="0" r="0" b="0"/>
             <wp:docPr id="1472585598" name="drawing"/>
@@ -61,6 +61,73 @@
           </wp:inline>
         </w:drawing>
       </w:r>
+    </w:p>
+    <w:p>
+      <w:pPr>
+        <w:pStyle w:val="Normal"/>
+      </w:pPr>
+      <w:r>
+        <w:drawing>
+          <wp:inline wp14:editId="54AEE012" wp14:anchorId="0662E840">
+            <wp:extent cx="5943600" cy="3067050"/>
+            <wp:effectExtent l="9525" t="9525" r="9525" b="9525"/>
+            <wp:docPr id="320896082" name="drawing"/>
+            <wp:cNvGraphicFramePr>
+              <a:graphicFrameLocks noChangeAspect="1"/>
+            </wp:cNvGraphicFramePr>
+            <a:graphic>
+              <a:graphicData xmlns:a="http://schemas.openxmlformats.org/drawingml/2006/main" uri="http://schemas.openxmlformats.org/drawingml/2006/picture">
+                <pic:pic xmlns:pic="http://schemas.openxmlformats.org/drawingml/2006/picture">
+                  <pic:nvPicPr>
+                    <pic:cNvPr id="320896082" name="Picture 320896082"/>
+                    <pic:cNvPicPr/>
+                  </pic:nvPicPr>
+                  <pic:blipFill>
+                    <a:blip xmlns:r="http://schemas.openxmlformats.org/officeDocument/2006/relationships" r:embed="rId537322380">
+                      <a:extLst>
+                        <a:ext uri="{28A0092B-C50C-407E-A947-70E740481C1C}">
+                          <a14:useLocalDpi xmlns:a14="http://schemas.microsoft.com/office/drawing/2010/main"/>
+                        </a:ext>
+                      </a:extLst>
+                    </a:blip>
+                    <a:stretch>
+                      <a:fillRect/>
+                    </a:stretch>
+                  </pic:blipFill>
+                  <pic:spPr>
+                    <a:xfrm>
+                      <a:off x="0" y="0"/>
+                      <a:ext cx="5943600" cy="3067050"/>
+                    </a:xfrm>
+                    <a:prstGeom prst="rect">
+                      <a:avLst/>
+                    </a:prstGeom>
+                    <a:ln w="9525">
+                      <a:solidFill>
+                        <a:schemeClr val="tx1"/>
+                      </a:solidFill>
+                      <a:prstDash val="solid"/>
+                    </a:ln>
+                  </pic:spPr>
+                </pic:pic>
+              </a:graphicData>
+            </a:graphic>
+          </wp:inline>
+        </w:drawing>
+      </w:r>
+      <w:hyperlink r:id="Rdc5bd3fa3f824e99">
+        <w:r>
+          <w:rPr>
+            <w:rStyle w:val="Hyperlink"/>
+          </w:rPr>
+          <w:t>https://github.com/ThyNoi/csd-325.git</w:t>
+        </w:r>
+      </w:hyperlink>
+    </w:p>
+    <w:p>
+      <w:pPr>
+        <w:pStyle w:val="Normal"/>
+      </w:pPr>
     </w:p>
     <w:sectPr>
       <w:pgSz w:w="12240" w:h="15840" w:orient="portrait"/>
@@ -493,6 +560,17 @@
     <w:semiHidden/>
     <w:unhideWhenUsed/>
   </w:style>
+  <w:style w:type="character" w:styleId="Hyperlink">
+    <w:uiPriority w:val="99"/>
+    <w:name w:val="Hyperlink"/>
+    <w:basedOn w:val="DefaultParagraphFont"/>
+    <w:unhideWhenUsed/>
+    <w:rsid w:val="3183DA60"/>
+    <w:rPr>
+      <w:color w:val="467886"/>
+      <w:u w:val="single"/>
+    </w:rPr>
+  </w:style>
 </w:styles>
 </file>
 

</xml_diff>

<commit_message>
Update the date on mod 1, 1.2 assignment
</commit_message>
<xml_diff>
--- a/module-1/Sengvanhpheng-Assignment1_2.docx
+++ b/module-1/Sengvanhpheng-Assignment1_2.docx
@@ -6,6 +6,12 @@
       <w:r>
         <w:rPr/>
         <w:t>Eric Sengvanhpheng</w:t>
+      </w:r>
+    </w:p>
+    <w:p>
+      <w:r>
+        <w:rPr/>
+        <w:t>June 6, 2026</w:t>
       </w:r>
     </w:p>
     <w:p>
@@ -68,7 +74,7 @@
       </w:pPr>
       <w:r>
         <w:drawing>
-          <wp:inline wp14:editId="54AEE012" wp14:anchorId="0662E840">
+          <wp:inline wp14:editId="5D8FA7FE" wp14:anchorId="0662E840">
             <wp:extent cx="5943600" cy="3067050"/>
             <wp:effectExtent l="9525" t="9525" r="9525" b="9525"/>
             <wp:docPr id="320896082" name="drawing"/>
@@ -115,7 +121,7 @@
           </wp:inline>
         </w:drawing>
       </w:r>
-      <w:hyperlink r:id="Rdc5bd3fa3f824e99">
+      <w:hyperlink r:id="Re64283879924464d">
         <w:r>
           <w:rPr>
             <w:rStyle w:val="Hyperlink"/>
@@ -123,11 +129,6 @@
           <w:t>https://github.com/ThyNoi/csd-325.git</w:t>
         </w:r>
       </w:hyperlink>
-    </w:p>
-    <w:p>
-      <w:pPr>
-        <w:pStyle w:val="Normal"/>
-      </w:pPr>
     </w:p>
     <w:sectPr>
       <w:pgSz w:w="12240" w:h="15840" w:orient="portrait"/>

</xml_diff>